<commit_message>
Timeline chart: clearer bars and lighter table shading
</commit_message>
<xml_diff>
--- a/docs/proposal.docx
+++ b/docs/proposal.docx
@@ -41,6 +41,7 @@
           <w:tcPr>
             <w:cnfStyle w:val="001000000000" w:firstRow="0" w:lastRow="0" w:firstColumn="1" w:lastColumn="0" w:oddVBand="0" w:evenVBand="0" w:oddHBand="0" w:evenHBand="0" w:firstRowFirstColumn="0" w:firstRowLastColumn="0" w:lastRowFirstColumn="0" w:lastRowLastColumn="0"/>
             <w:tcW w:w="2041" w:type="dxa"/>
+            <w:shd w:val="clear" w:color="auto" w:fill="FFFFFF"/>
           </w:tcPr>
           <w:p>
             <w:r>
@@ -54,6 +55,7 @@
         <w:tc>
           <w:tcPr>
             <w:tcW w:w="8050" w:type="dxa"/>
+            <w:shd w:val="clear" w:color="auto" w:fill="FFFFFF"/>
           </w:tcPr>
           <w:p>
             <w:pPr>
@@ -82,6 +84,7 @@
           <w:tcPr>
             <w:cnfStyle w:val="001000000000" w:firstRow="0" w:lastRow="0" w:firstColumn="1" w:lastColumn="0" w:oddVBand="0" w:evenVBand="0" w:oddHBand="0" w:evenHBand="0" w:firstRowFirstColumn="0" w:firstRowLastColumn="0" w:lastRowFirstColumn="0" w:lastRowLastColumn="0"/>
             <w:tcW w:w="2041" w:type="dxa"/>
+            <w:shd w:val="clear" w:color="auto" w:fill="F2F2F2"/>
           </w:tcPr>
           <w:p>
             <w:r>
@@ -95,6 +98,7 @@
         <w:tc>
           <w:tcPr>
             <w:tcW w:w="8050" w:type="dxa"/>
+            <w:shd w:val="clear" w:color="auto" w:fill="F2F2F2"/>
           </w:tcPr>
           <w:p>
             <w:pPr>
@@ -117,6 +121,7 @@
           <w:tcPr>
             <w:cnfStyle w:val="001000000000" w:firstRow="0" w:lastRow="0" w:firstColumn="1" w:lastColumn="0" w:oddVBand="0" w:evenVBand="0" w:oddHBand="0" w:evenHBand="0" w:firstRowFirstColumn="0" w:firstRowLastColumn="0" w:lastRowFirstColumn="0" w:lastRowLastColumn="0"/>
             <w:tcW w:w="2041" w:type="dxa"/>
+            <w:shd w:val="clear" w:color="auto" w:fill="FFFFFF"/>
           </w:tcPr>
           <w:p>
             <w:r>
@@ -130,6 +135,7 @@
         <w:tc>
           <w:tcPr>
             <w:tcW w:w="8050" w:type="dxa"/>
+            <w:shd w:val="clear" w:color="auto" w:fill="FFFFFF"/>
           </w:tcPr>
           <w:p>
             <w:pPr>
@@ -152,6 +158,7 @@
           <w:tcPr>
             <w:cnfStyle w:val="001000000000" w:firstRow="0" w:lastRow="0" w:firstColumn="1" w:lastColumn="0" w:oddVBand="0" w:evenVBand="0" w:oddHBand="0" w:evenHBand="0" w:firstRowFirstColumn="0" w:firstRowLastColumn="0" w:lastRowFirstColumn="0" w:lastRowLastColumn="0"/>
             <w:tcW w:w="2041" w:type="dxa"/>
+            <w:shd w:val="clear" w:color="auto" w:fill="F2F2F2"/>
           </w:tcPr>
           <w:p>
             <w:r>
@@ -165,6 +172,7 @@
         <w:tc>
           <w:tcPr>
             <w:tcW w:w="8050" w:type="dxa"/>
+            <w:shd w:val="clear" w:color="auto" w:fill="F2F2F2"/>
           </w:tcPr>
           <w:p>
             <w:pPr>
@@ -187,6 +195,7 @@
           <w:tcPr>
             <w:cnfStyle w:val="001000000000" w:firstRow="0" w:lastRow="0" w:firstColumn="1" w:lastColumn="0" w:oddVBand="0" w:evenVBand="0" w:oddHBand="0" w:evenHBand="0" w:firstRowFirstColumn="0" w:firstRowLastColumn="0" w:lastRowFirstColumn="0" w:lastRowLastColumn="0"/>
             <w:tcW w:w="2041" w:type="dxa"/>
+            <w:shd w:val="clear" w:color="auto" w:fill="FFFFFF"/>
           </w:tcPr>
           <w:p>
             <w:r>
@@ -200,6 +209,7 @@
         <w:tc>
           <w:tcPr>
             <w:tcW w:w="8050" w:type="dxa"/>
+            <w:shd w:val="clear" w:color="auto" w:fill="FFFFFF"/>
           </w:tcPr>
           <w:p>
             <w:pPr>
@@ -225,6 +235,7 @@
           <w:tcPr>
             <w:cnfStyle w:val="001000000000" w:firstRow="0" w:lastRow="0" w:firstColumn="1" w:lastColumn="0" w:oddVBand="0" w:evenVBand="0" w:oddHBand="0" w:evenHBand="0" w:firstRowFirstColumn="0" w:firstRowLastColumn="0" w:lastRowFirstColumn="0" w:lastRowLastColumn="0"/>
             <w:tcW w:w="2041" w:type="dxa"/>
+            <w:shd w:val="clear" w:color="auto" w:fill="F2F2F2"/>
           </w:tcPr>
           <w:p>
             <w:r>
@@ -238,6 +249,7 @@
         <w:tc>
           <w:tcPr>
             <w:tcW w:w="8050" w:type="dxa"/>
+            <w:shd w:val="clear" w:color="auto" w:fill="F2F2F2"/>
           </w:tcPr>
           <w:p>
             <w:pPr>
@@ -272,6 +284,7 @@
           <w:tcPr>
             <w:cnfStyle w:val="001000000000" w:firstRow="0" w:lastRow="0" w:firstColumn="1" w:lastColumn="0" w:oddVBand="0" w:evenVBand="0" w:oddHBand="0" w:evenHBand="0" w:firstRowFirstColumn="0" w:firstRowLastColumn="0" w:lastRowFirstColumn="0" w:lastRowLastColumn="0"/>
             <w:tcW w:w="2041" w:type="dxa"/>
+            <w:shd w:val="clear" w:color="auto" w:fill="FFFFFF"/>
           </w:tcPr>
           <w:p>
             <w:r>
@@ -285,6 +298,7 @@
         <w:tc>
           <w:tcPr>
             <w:tcW w:w="8050" w:type="dxa"/>
+            <w:shd w:val="clear" w:color="auto" w:fill="FFFFFF"/>
           </w:tcPr>
           <w:p>
             <w:pPr>
@@ -307,6 +321,7 @@
           <w:tcPr>
             <w:cnfStyle w:val="001000000000" w:firstRow="0" w:lastRow="0" w:firstColumn="1" w:lastColumn="0" w:oddVBand="0" w:evenVBand="0" w:oddHBand="0" w:evenHBand="0" w:firstRowFirstColumn="0" w:firstRowLastColumn="0" w:lastRowFirstColumn="0" w:lastRowLastColumn="0"/>
             <w:tcW w:w="2041" w:type="dxa"/>
+            <w:shd w:val="clear" w:color="auto" w:fill="F2F2F2"/>
           </w:tcPr>
           <w:p>
             <w:r>
@@ -320,6 +335,7 @@
         <w:tc>
           <w:tcPr>
             <w:tcW w:w="8050" w:type="dxa"/>
+            <w:shd w:val="clear" w:color="auto" w:fill="F2F2F2"/>
           </w:tcPr>
           <w:p>
             <w:pPr>
@@ -342,6 +358,7 @@
           <w:tcPr>
             <w:cnfStyle w:val="001000000000" w:firstRow="0" w:lastRow="0" w:firstColumn="1" w:lastColumn="0" w:oddVBand="0" w:evenVBand="0" w:oddHBand="0" w:evenHBand="0" w:firstRowFirstColumn="0" w:firstRowLastColumn="0" w:lastRowFirstColumn="0" w:lastRowLastColumn="0"/>
             <w:tcW w:w="2041" w:type="dxa"/>
+            <w:shd w:val="clear" w:color="auto" w:fill="FFFFFF"/>
           </w:tcPr>
           <w:p>
             <w:r>
@@ -355,6 +372,7 @@
         <w:tc>
           <w:tcPr>
             <w:tcW w:w="8050" w:type="dxa"/>
+            <w:shd w:val="clear" w:color="auto" w:fill="FFFFFF"/>
           </w:tcPr>
           <w:p>
             <w:pPr>
@@ -377,6 +395,7 @@
           <w:tcPr>
             <w:cnfStyle w:val="001000000000" w:firstRow="0" w:lastRow="0" w:firstColumn="1" w:lastColumn="0" w:oddVBand="0" w:evenVBand="0" w:oddHBand="0" w:evenHBand="0" w:firstRowFirstColumn="0" w:firstRowLastColumn="0" w:lastRowFirstColumn="0" w:lastRowLastColumn="0"/>
             <w:tcW w:w="2041" w:type="dxa"/>
+            <w:shd w:val="clear" w:color="auto" w:fill="F2F2F2"/>
           </w:tcPr>
           <w:p>
             <w:r>
@@ -390,6 +409,7 @@
         <w:tc>
           <w:tcPr>
             <w:tcW w:w="8050" w:type="dxa"/>
+            <w:shd w:val="clear" w:color="auto" w:fill="F2F2F2"/>
           </w:tcPr>
           <w:p>
             <w:pPr>
@@ -440,6 +460,7 @@
           <w:tcPr>
             <w:cnfStyle w:val="001000000000" w:firstRow="0" w:lastRow="0" w:firstColumn="1" w:lastColumn="0" w:oddVBand="0" w:evenVBand="0" w:oddHBand="0" w:evenHBand="0" w:firstRowFirstColumn="0" w:firstRowLastColumn="0" w:lastRowFirstColumn="0" w:lastRowLastColumn="0"/>
             <w:tcW w:w="2041" w:type="dxa"/>
+            <w:shd w:val="clear" w:color="auto" w:fill="FFFFFF"/>
           </w:tcPr>
           <w:p>
             <w:r>
@@ -453,6 +474,7 @@
         <w:tc>
           <w:tcPr>
             <w:tcW w:w="8050" w:type="dxa"/>
+            <w:shd w:val="clear" w:color="auto" w:fill="FFFFFF"/>
           </w:tcPr>
           <w:p>
             <w:pPr>
@@ -475,6 +497,7 @@
           <w:tcPr>
             <w:cnfStyle w:val="001000000000" w:firstRow="0" w:lastRow="0" w:firstColumn="1" w:lastColumn="0" w:oddVBand="0" w:evenVBand="0" w:oddHBand="0" w:evenHBand="0" w:firstRowFirstColumn="0" w:firstRowLastColumn="0" w:lastRowFirstColumn="0" w:lastRowLastColumn="0"/>
             <w:tcW w:w="2041" w:type="dxa"/>
+            <w:shd w:val="clear" w:color="auto" w:fill="F2F2F2"/>
           </w:tcPr>
           <w:p>
             <w:r>
@@ -488,6 +511,7 @@
         <w:tc>
           <w:tcPr>
             <w:tcW w:w="8050" w:type="dxa"/>
+            <w:shd w:val="clear" w:color="auto" w:fill="F2F2F2"/>
           </w:tcPr>
           <w:p>
             <w:pPr>
@@ -510,6 +534,7 @@
           <w:tcPr>
             <w:cnfStyle w:val="001000000000" w:firstRow="0" w:lastRow="0" w:firstColumn="1" w:lastColumn="0" w:oddVBand="0" w:evenVBand="0" w:oddHBand="0" w:evenHBand="0" w:firstRowFirstColumn="0" w:firstRowLastColumn="0" w:lastRowFirstColumn="0" w:lastRowLastColumn="0"/>
             <w:tcW w:w="2041" w:type="dxa"/>
+            <w:shd w:val="clear" w:color="auto" w:fill="FFFFFF"/>
           </w:tcPr>
           <w:p>
             <w:r>
@@ -523,6 +548,7 @@
         <w:tc>
           <w:tcPr>
             <w:tcW w:w="8050" w:type="dxa"/>
+            <w:shd w:val="clear" w:color="auto" w:fill="FFFFFF"/>
           </w:tcPr>
           <w:p>
             <w:pPr>
@@ -545,6 +571,7 @@
           <w:tcPr>
             <w:cnfStyle w:val="001000000000" w:firstRow="0" w:lastRow="0" w:firstColumn="1" w:lastColumn="0" w:oddVBand="0" w:evenVBand="0" w:oddHBand="0" w:evenHBand="0" w:firstRowFirstColumn="0" w:firstRowLastColumn="0" w:lastRowFirstColumn="0" w:lastRowLastColumn="0"/>
             <w:tcW w:w="2041" w:type="dxa"/>
+            <w:shd w:val="clear" w:color="auto" w:fill="F2F2F2"/>
           </w:tcPr>
           <w:p>
             <w:r>
@@ -558,6 +585,7 @@
         <w:tc>
           <w:tcPr>
             <w:tcW w:w="8050" w:type="dxa"/>
+            <w:shd w:val="clear" w:color="auto" w:fill="F2F2F2"/>
           </w:tcPr>
           <w:p>
             <w:pPr>
@@ -580,6 +608,7 @@
           <w:tcPr>
             <w:cnfStyle w:val="001000000000" w:firstRow="0" w:lastRow="0" w:firstColumn="1" w:lastColumn="0" w:oddVBand="0" w:evenVBand="0" w:oddHBand="0" w:evenHBand="0" w:firstRowFirstColumn="0" w:firstRowLastColumn="0" w:lastRowFirstColumn="0" w:lastRowLastColumn="0"/>
             <w:tcW w:w="2041" w:type="dxa"/>
+            <w:shd w:val="clear" w:color="auto" w:fill="FFFFFF"/>
           </w:tcPr>
           <w:p>
             <w:r>
@@ -593,6 +622,7 @@
         <w:tc>
           <w:tcPr>
             <w:tcW w:w="8050" w:type="dxa"/>
+            <w:shd w:val="clear" w:color="auto" w:fill="FFFFFF"/>
           </w:tcPr>
           <w:p>
             <w:pPr>
@@ -670,6 +700,7 @@
           <w:tcPr>
             <w:cnfStyle w:val="001000000000" w:firstRow="0" w:lastRow="0" w:firstColumn="1" w:lastColumn="0" w:oddVBand="0" w:evenVBand="0" w:oddHBand="0" w:evenHBand="0" w:firstRowFirstColumn="0" w:firstRowLastColumn="0" w:lastRowFirstColumn="0" w:lastRowLastColumn="0"/>
             <w:tcW w:w="2041" w:type="dxa"/>
+            <w:shd w:val="clear" w:color="auto" w:fill="F2F2F2"/>
           </w:tcPr>
           <w:p>
             <w:r>
@@ -683,6 +714,7 @@
         <w:tc>
           <w:tcPr>
             <w:tcW w:w="8050" w:type="dxa"/>
+            <w:shd w:val="clear" w:color="auto" w:fill="F2F2F2"/>
           </w:tcPr>
           <w:p>
             <w:pPr>

</xml_diff>

<commit_message>
Proposal, slides and README worded along the lecture slides and example concept presentation
</commit_message>
<xml_diff>
--- a/docs/proposal.docx
+++ b/docs/proposal.docx
@@ -308,7 +308,7 @@
               <w:rPr>
                 <w:sz w:val="16"/>
               </w:rPr>
-              <w:t>Quality control in electronics assembly (SMT soldering): the step after automated optical inspection (AOI), where flagged boards go to manual inspection. A current industrial problem: on 21 Oct 2026 Siemens and NVIDIA announced an AI second check of AOI results at the Siemens electronics factory in Erlangen, targeting about 40 % fewer false calls and less manual verification. Based on the lecture example “Siemens – Quality Control and Defect Detection” (p. 18); real data from a Siemens production line in Bavaria.</w:t>
+              <w:t>Quality inspection in assembly, quality assurance/defect inspection (lecture p. 14): implementation of an AI-powered quality control and defect detection system in electronics assembly, based on the lecture example “Siemens – Quality Control and Defect Detection” (p. 18). Application in manufacturing processes: the step after automated optical inspection (AOI), where flagged boards go to manual inspection. A current industrial problem: on 21 Oct 2026 Siemens and NVIDIA announced an AI second check of AOI results at the Siemens electronics factory in Erlangen (about 40 % fewer false calls targeted). Real data from a Siemens production line in Bavaria.</w:t>
             </w:r>
           </w:p>
         </w:tc>
@@ -345,7 +345,7 @@
               <w:rPr>
                 <w:sz w:val="16"/>
               </w:rPr>
-              <w:t>quality control, automated optical inspection, false-call reduction, machine learning, neural networks, concept drift</w:t>
+              <w:t>AI-powered quality control, defect detection, automated optical inspection, machine learning, neural networks, big data processing</w:t>
             </w:r>
           </w:p>
         </w:tc>
@@ -484,7 +484,7 @@
               <w:rPr>
                 <w:sz w:val="16"/>
               </w:rPr>
-              <w:t>After soldering, an AOI camera system measures every solder joint against fixed limits, and flagged boards go to a manual inspection station. In the Siemens data about 98 % of flagged boards are false calls (good boards), which costs a large amount of manual work, and the line drifts over time. We build an AI decision gate: Input = AOI measurements of a flagged board; System = classifier trained on past manual-inspection results; Output = release the board, or send it to manual inspection. Targets, tested by replaying the later days in time order: at most 1 % of defective boards released, at least 25 % of false-call boards released (baseline: 8.2 %), and an alarm when performance drops.</w:t>
+              <w:t>After soldering, an AI-powered computer vision system (AOI) inspects every electronic component and solder joint and compares each measurement with fixed limits. Flagged boards go to a manual inspection station. In the Siemens data about 98 % of flagged boards are false calls (good boards): a large manual effort, and the line changes over time. Input = AOI measurements of a flagged board; System = AI decision gate (classifier trained on past manual-inspection results, decision-making by threshold); Output = release the board, or send it to manual inspection. Targets, tested in a simulation of the line in time order: at most 1 % of defective boards released, at least 25 % of false-call boards released (baseline: 8.2 %), and an alarm when performance drops.</w:t>
             </w:r>
           </w:p>
         </w:tc>
@@ -521,7 +521,7 @@
               <w:rPr>
                 <w:sz w:val="16"/>
               </w:rPr>
-              <w:t>Every false call costs operator time and slows the line; every released defect reaches the customer. Siemens states that factories in high-wage countries need 7–9 % more productivity every year (Erlangen, Oct 2026). A reliable gate saves manual work without lowering quality.</w:t>
+              <w:t>Key motivations: reduce dependence on manual quality checks; keep product quality (no more defects released); increase efficiency of the assembly line. Benefits as in the lecture example: improved product quality, reduced waste, increased efficiency. Siemens states that factories in high-wage countries need 7–9 % more productivity every year (Erlangen, Oct 2026).</w:t>
             </w:r>
           </w:p>
         </w:tc>
@@ -558,7 +558,7 @@
               <w:rPr>
                 <w:sz w:val="16"/>
               </w:rPr>
-              <w:t>Pfab et al. (2024): Siemens AOI dataset, 132 days, true defect vs false call; notes drift and label errors. Albayari et al. (2025): XGBoost, random forest and neural networks as a second classifier on Siemens AOI data. Schmitt et al. (2020): machine learning at Siemens Amberg predicts inspection results to reduce X-ray inspection. Our focus: evaluation in time order as on the real line, a fixed limit on missed defects, and drift handling.</w:t>
+              <w:t>Pfab et al. (2024): Siemens AOI dataset, 132 days, true defect vs false call; notes drift and label errors. Albayari et al. (2025): XGBoost, random forest and neural networks as a second classifier on Siemens AOI data. Schmitt et al. (2020): machine learning at Siemens Amberg predicts inspection results to reduce X-ray inspection. Gap: evaluation in time order as on the real line, a fixed limit on missed defects, and handling of changes over time.</w:t>
             </w:r>
           </w:p>
         </w:tc>
@@ -595,7 +595,7 @@
               <w:rPr>
                 <w:sz w:val="16"/>
               </w:rPr>
-              <w:t>Methodology: CRISP-DM (business understanding, data understanding, preparation, modelling, evaluation, deployment). Data: Pfab et al. (2024), Mendeley, CC BY-NC 3.0: 440,274 flagged solder joints on 39,742 boards, about 70 AOI measurements plus component type, error code and inspection type, labelled by manual inspection. Models: gradient-boosted trees and a neural network (PyTorch); threshold set so that at most 1 % of defective boards are released. Simulation: a day-by-day replay of the line (train on past days, decide on the next day, retrain on a schedule) measures released false calls, missed defects and saved inspections. Baseline already runs: trained on the first 70 % of days and catching 99 % of defective boards, it releases 8.2 % of false-call boards (29 % with a random split), so drift is the main challenge. Deliverables: a Python software prototype (command-line tool: train; decide per board → release or inspect; replay) with a replay web dashboard, tests on GitHub, demo video and report.</w:t>
+              <w:t>Methodology: CRISP-DM. Step 1 Data preparation: Siemens AOI data (Pfab et al. 2024, Mendeley, CC BY-NC 3.0), 440,274 flagged solder joints on 39,742 boards, about 70 AOI measurements plus component type, error code and inspection type, labelled by manual inspection; split strictly by time into train, validate, test. Step 2 Model development: gradient-boosted trees (baseline) and a neural network (PyTorch); threshold set so that at most 1 % of defective boards are released. Step 3 Simulation integration: a day-by-day simulation of the line (train on past days, decide on the next day, retrain on a schedule); boards are virtually routed to release or manual inspection. Step 4 Evaluation and comparison: defective boards released, manual inspections saved, precision, recall; compare models and update policies. Baseline already runs: catching 99 % of defective boards, it releases 8.2 % of false-call boards (29 % with a random split). Deliverables: Python software prototype (command-line tool and web dashboard), tests on GitHub, demo video, report.</w:t>
             </w:r>
           </w:p>
         </w:tc>
@@ -632,7 +632,7 @@
               <w:rPr>
                 <w:sz w:val="16"/>
               </w:rPr>
-              <w:t>P1 23 Oct: revised topic, data set, baseline running</w:t>
+              <w:t>P1 23 Oct: proposal + tech stack + MVP (data set, baseline running)</w:t>
             </w:r>
           </w:p>
           <w:p>
@@ -643,7 +643,7 @@
               <w:rPr>
                 <w:sz w:val="16"/>
               </w:rPr>
-              <w:t>P2 3 Nov: core code, baseline replay simulation, test plan, report</w:t>
+              <w:t>P2 3 Nov: core code + baseline sim; test plan + report</w:t>
             </w:r>
           </w:p>
           <w:p>
@@ -654,7 +654,7 @@
               <w:rPr>
                 <w:sz w:val="16"/>
               </w:rPr>
-              <w:t>P3 24 Nov: models and drift handling, unit tests and CI, issues board</w:t>
+              <w:t>P3 24 Nov: feature progress (neural network, drift alarm); unit/CI status; issues board</w:t>
             </w:r>
           </w:p>
           <w:p>
@@ -665,7 +665,7 @@
               <w:rPr>
                 <w:sz w:val="16"/>
               </w:rPr>
-              <w:t>P4 8 Dec: full evaluation and error analysis</w:t>
+              <w:t>P4 8 Dec: feature progress (full evaluation, error analysis); unit/CI status; issues board</w:t>
             </w:r>
           </w:p>
           <w:p>
@@ -676,7 +676,7 @@
               <w:rPr>
                 <w:sz w:val="16"/>
               </w:rPr>
-              <w:t>P5 22 Dec: replay demo, demo video, run instructions, packaging</w:t>
+              <w:t>P5 22 Dec: demo video + run instructions; packaging status</w:t>
             </w:r>
           </w:p>
           <w:p>
@@ -687,7 +687,7 @@
               <w:rPr>
                 <w:sz w:val="16"/>
               </w:rPr>
-              <w:t>Final 12 Jan: final report and presentation</w:t>
+              <w:t>Final 12 Jan: final presentation, report (KPIs)</w:t>
             </w:r>
           </w:p>
         </w:tc>
@@ -724,7 +724,7 @@
               <w:rPr>
                 <w:sz w:val="16"/>
               </w:rPr>
-              <w:t>Conditions and limits: one Siemens line, five inspection types; measurements are anonymised (scaled 0–1, no physical names), labels may contain human errors, and there are no images. Data licence is non-commercial (course use only); no personal data. Main risk: drift limits the release rate (fallback: report which drift handling works and why).</w:t>
+              <w:t>Simulation-only environment; no physical machinery risk. Dataset is anonymised (measurements scaled 0–1, no personal data); licence non-commercial (course use only). Ethical AI principles followed: transparency, fairness, accountability; avoid dataset bias (time split, label errors) and ensure reproducibility of results. Main risk: changes over time limit the release rate (fallback: report which handling works and why).</w:t>
             </w:r>
           </w:p>
         </w:tc>

</xml_diff>

<commit_message>
Standard models from the lecture tools (scikit-learn): logistic regression, random forest, neural network; focused proposal and 16 slides
</commit_message>
<xml_diff>
--- a/docs/proposal.docx
+++ b/docs/proposal.docx
@@ -145,7 +145,7 @@
               <w:rPr>
                 <w:sz w:val="16"/>
               </w:rPr>
-              <w:t>Team lead and core code: Yu Han. Work packages are shared by all four members and tracked on the GitHub issues board.</w:t>
+              <w:t>Team lead and core code: Yu Han. Work packages are shared by all four members.</w:t>
             </w:r>
           </w:p>
         </w:tc>
@@ -308,7 +308,7 @@
               <w:rPr>
                 <w:sz w:val="16"/>
               </w:rPr>
-              <w:t>Quality inspection in assembly, quality assurance/defect inspection (lecture p. 14): implementation of an AI-powered quality control and defect detection system in electronics assembly, based on the lecture example “Siemens – Quality Control and Defect Detection” (p. 18). Application in manufacturing processes: the step after automated optical inspection (AOI), where flagged boards go to manual inspection. A current industrial problem: on 21 Oct 2026 Siemens and NVIDIA announced an AI second check of AOI results at the Siemens electronics factory in Erlangen (about 40 % fewer false calls targeted). Real data from a Siemens production line in Bavaria.</w:t>
+              <w:t>Quality inspection in electronics assembly, based on the lecture example “Siemens – Quality Control and Defect Detection” (p. 18). After automated optical inspection (AOI), flagged boards go to manual inspection. Current problem: on 21 Oct 2026 Siemens and NVIDIA announced an AI second check of AOI results in the Siemens electronics factory in Erlangen, targeting about 40 % fewer false calls.</w:t>
             </w:r>
           </w:p>
         </w:tc>
@@ -345,7 +345,7 @@
               <w:rPr>
                 <w:sz w:val="16"/>
               </w:rPr>
-              <w:t>AI-powered quality control, defect detection, automated optical inspection, machine learning, neural networks, big data processing</w:t>
+              <w:t>quality control, defect detection, automated optical inspection, machine learning, neural network, big data processing</w:t>
             </w:r>
           </w:p>
         </w:tc>
@@ -484,7 +484,7 @@
               <w:rPr>
                 <w:sz w:val="16"/>
               </w:rPr>
-              <w:t>After soldering, an AI-powered computer vision system (AOI) inspects every electronic component and solder joint and compares each measurement with fixed limits. Flagged boards go to a manual inspection station. In the Siemens data about 98 % of flagged boards are false calls (good boards): a large manual effort, and the line changes over time. Input = AOI measurements of a flagged board; System = AI decision gate (classifier trained on past manual-inspection results, decision-making by threshold); Output = release the board, or send it to manual inspection. Targets, tested in a simulation of the line in time order: at most 1 % of defective boards released, at least 25 % of false-call boards released (baseline: 8.2 %), and an alarm when performance drops.</w:t>
+              <w:t>After soldering, an AOI camera system checks every solder joint against fixed limits and sends flagged boards to manual inspection. In real Siemens production data about 98 % of the flagged boards are false calls, so operators check thousands of good boards. Input: AOI measurements of a flagged board → System: AI decision gate (classifier + threshold) → Output: release the board or send it to manual inspection. Measurable outcomes: defective boards released ≤ 1 %; false-call boards released ≥ 20 % (baseline 6.4 %); precision and recall.</w:t>
             </w:r>
           </w:p>
         </w:tc>
@@ -521,7 +521,7 @@
               <w:rPr>
                 <w:sz w:val="16"/>
               </w:rPr>
-              <w:t>Key motivations: reduce dependence on manual quality checks; keep product quality (no more defects released); increase efficiency of the assembly line. Benefits as in the lecture example: improved product quality, reduced waste, increased efficiency. Siemens states that factories in high-wage countries need 7–9 % more productivity every year (Erlangen, Oct 2026).</w:t>
+              <w:t>Key motivations: reduce dependence on manual quality checks, keep product quality, and increase efficiency of the assembly line (lecture goal: better quality). Siemens is working on exactly this problem in its Erlangen electronics factory (Oct 2026).</w:t>
             </w:r>
           </w:p>
         </w:tc>
@@ -558,7 +558,7 @@
               <w:rPr>
                 <w:sz w:val="16"/>
               </w:rPr>
-              <w:t>Pfab et al. (2024): Siemens AOI dataset, 132 days, true defect vs false call; notes drift and label errors. Albayari et al. (2025): XGBoost, random forest and neural networks as a second classifier on Siemens AOI data. Schmitt et al. (2020): machine learning at Siemens Amberg predicts inspection results to reduce X-ray inspection. Gap: evaluation in time order as on the real line, a fixed limit on missed defects, and handling of changes over time.</w:t>
+              <w:t>Pfab et al. (2024) published the Siemens AOI data. Albayari et al. (2025) used XGBoost, random forest and neural networks on the same data with a random split. Gap addressed: evaluation in time order, as on the real line, with a fixed limit on released defects.</w:t>
             </w:r>
           </w:p>
         </w:tc>
@@ -595,7 +595,7 @@
               <w:rPr>
                 <w:sz w:val="16"/>
               </w:rPr>
-              <w:t>Methodology: CRISP-DM. Step 1 Data preparation: Siemens AOI data (Pfab et al. 2024, Mendeley, CC BY-NC 3.0), 440,274 flagged solder joints on 39,742 boards, about 70 AOI measurements plus component type, error code and inspection type, labelled by manual inspection; split strictly by time into train, validate, test. Step 2 Model development: gradient-boosted trees (baseline) and a neural network (PyTorch); threshold set so that at most 1 % of defective boards are released. Step 3 Simulation integration: a day-by-day simulation of the line (train on past days, decide on the next day, retrain on a schedule); boards are virtually routed to release or manual inspection. Step 4 Evaluation and comparison: defective boards released, manual inspections saved, precision, recall; compare models and update policies. Baseline already runs: catching 99 % of defective boards, it releases 8.2 % of false-call boards (29 % with a random split). Deliverables: Python software prototype (command-line tool and web dashboard), tests on GitHub, demo video, report.</w:t>
+              <w:t>Methodology: CRISP-DM. Data: Siemens AOI data (Mendeley, CC BY-NC 3.0), 440,274 flagged solder joints on 39,742 boards from 132 days, about 70 measurements each, labelled by manual inspection. Models (scikit-learn): logistic regression (baseline), random forest, and a neural network with one hidden layer (lecture p. 12, 17). Simulation: the line is simulated day by day; each day is decided by a model trained on earlier days only. MVP running: in time order 1.8–6.4 % of false-call boards can be released while 99 % of defects are caught (14–18 % with a random split). Deliverables: Python software prototype, notebook, tests on GitHub, demo video, report (IEEE template).</w:t>
             </w:r>
           </w:p>
         </w:tc>
@@ -632,7 +632,7 @@
               <w:rPr>
                 <w:sz w:val="16"/>
               </w:rPr>
-              <w:t>P1 23 Oct: proposal + tech stack + MVP (data set, baseline running)</w:t>
+              <w:t>P1 23 Oct · S1 select topic &amp; write proposal: proposal + tech stack + MVP</w:t>
             </w:r>
           </w:p>
           <w:p>
@@ -643,7 +643,7 @@
               <w:rPr>
                 <w:sz w:val="16"/>
               </w:rPr>
-              <w:t>P2 3 Nov: core code + baseline sim; test plan + report</w:t>
+              <w:t>P2 3 Nov · S2 develop code &amp; simulation: core code + baseline sim; test plan + report</w:t>
             </w:r>
           </w:p>
           <w:p>
@@ -654,7 +654,7 @@
               <w:rPr>
                 <w:sz w:val="16"/>
               </w:rPr>
-              <w:t>P3 24 Nov: feature progress (neural network, drift alarm); unit/CI status; issues board</w:t>
+              <w:t>P3 24 Nov · S3 implement features &amp; testing: unit/CI status; issues board</w:t>
             </w:r>
           </w:p>
           <w:p>
@@ -665,7 +665,7 @@
               <w:rPr>
                 <w:sz w:val="16"/>
               </w:rPr>
-              <w:t>P4 8 Dec: feature progress (full evaluation, error analysis); unit/CI status; issues board</w:t>
+              <w:t>P4 8 Dec · S3 implement features &amp; testing: full evaluation, error analysis</w:t>
             </w:r>
           </w:p>
           <w:p>
@@ -676,7 +676,7 @@
               <w:rPr>
                 <w:sz w:val="16"/>
               </w:rPr>
-              <w:t>P5 22 Dec: demo video + run instructions; packaging status</w:t>
+              <w:t>P5 22 Dec · S4 demo video + instructions; S5 documentation &amp; packaging</w:t>
             </w:r>
           </w:p>
           <w:p>
@@ -687,7 +687,7 @@
               <w:rPr>
                 <w:sz w:val="16"/>
               </w:rPr>
-              <w:t>Final 12 Jan: final presentation, report (KPIs)</w:t>
+              <w:t>Final 12 Jan · S6 final presentation &amp; KPIs, report</w:t>
             </w:r>
           </w:p>
         </w:tc>
@@ -724,7 +724,7 @@
               <w:rPr>
                 <w:sz w:val="16"/>
               </w:rPr>
-              <w:t>Simulation-only environment; no physical machinery risk. Dataset is anonymised (measurements scaled 0–1, no personal data); licence non-commercial (course use only). Ethical AI principles followed: transparency, fairness, accountability; avoid dataset bias (time split, label errors) and ensure reproducibility of results. Main risk: changes over time limit the release rate (fallback: report which handling works and why).</w:t>
+              <w:t>Simulation-only environment; no physical machinery risk. Data anonymised by Siemens, no personal data; licence non-commercial (course use). Limits: one production line, 132 days, labels from operators. Main risk: the line changes over time, so the 1 % limit may not hold (fallback: report what works and why).</w:t>
             </w:r>
           </w:p>
         </w:tc>

</xml_diff>

<commit_message>
Standard terms: binary classification of AOI alarms (true defect or false call)
</commit_message>
<xml_diff>
--- a/docs/proposal.docx
+++ b/docs/proposal.docx
@@ -484,7 +484,7 @@
               <w:rPr>
                 <w:sz w:val="16"/>
               </w:rPr>
-              <w:t>After soldering, an AOI camera system checks every solder joint against fixed limits and sends flagged boards to manual inspection. In real Siemens production data about 98 % of the flagged boards are false calls, so operators check thousands of good boards. Input: AOI measurements of a flagged board → System: AI decision gate (classifier + threshold) → Output: release the board or send it to manual inspection. Measurable outcomes: defective boards released ≤ 1 %; false-call boards released ≥ 20 % (baseline 6.4 %); precision and recall.</w:t>
+              <w:t>After soldering, an AOI camera system checks every solder joint against fixed limits and sends flagged boards to manual inspection. In real Siemens production data about 98 % of the flagged boards are false calls, so operators check thousands of good boards. Input: the AOI alarm (measurements of a flagged board) → System: binary classification (supervised machine learning) trained on past manual-inspection results → Output: for each AOI alarm, true defect (manual inspection) or false call (skip manual inspection). Measurable outcomes: defective boards classified as false calls ≤ 1 %; false calls correctly identified ≥ 20 % (baseline 6.4 %); precision and recall.</w:t>
             </w:r>
           </w:p>
         </w:tc>
@@ -558,7 +558,7 @@
               <w:rPr>
                 <w:sz w:val="16"/>
               </w:rPr>
-              <w:t>Pfab et al. (2024) published the Siemens AOI data. Albayari et al. (2025) used XGBoost, random forest and neural networks on the same data with a random split. Gap addressed: evaluation in time order, as on the real line, with a fixed limit on released defects.</w:t>
+              <w:t>Pfab et al. (2024) published the Siemens AOI data. Albayari et al. (2025) used XGBoost, random forest and neural networks on the same data with a random split. Gap addressed: evaluation in time order, as on the real line, with a fixed limit on missed defects.</w:t>
             </w:r>
           </w:p>
         </w:tc>
@@ -595,7 +595,7 @@
               <w:rPr>
                 <w:sz w:val="16"/>
               </w:rPr>
-              <w:t>Methodology: CRISP-DM. Data: Siemens AOI data (Mendeley, CC BY-NC 3.0), 440,274 flagged solder joints on 39,742 boards from 132 days, about 70 measurements each, labelled by manual inspection. Models (scikit-learn): logistic regression (baseline), random forest, and a neural network with one hidden layer (lecture p. 12, 17). Simulation: the line is simulated day by day; each day is decided by a model trained on earlier days only. MVP running: in time order 1.8–6.4 % of false-call boards can be released while 99 % of defects are caught (14–18 % with a random split). Deliverables: Python software prototype, notebook, tests on GitHub, demo video, report (IEEE template).</w:t>
+              <w:t>Methodology: CRISP-DM. Data: Siemens AOI data (Mendeley, CC BY-NC 3.0), 440,274 flagged solder joints on 39,742 boards from 132 days, about 70 measurements each, labelled by manual inspection. Models (scikit-learn): logistic regression (baseline), random forest, and a neural network with one hidden layer (lecture p. 12, 17). Simulation: the line is simulated day by day; each day is decided by a model trained on earlier days only. MVP running: in time order 1.8–6.4 % of false calls are correctly identified while 99 % of defects are caught (14–18 % with a random split). Deliverables: Python software prototype, notebook, tests on GitHub, demo video, report (IEEE template).</w:t>
             </w:r>
           </w:p>
         </w:tc>

</xml_diff>

<commit_message>
Title: Second Check of AOI Results with Supervised Machine Learning
</commit_message>
<xml_diff>
--- a/docs/proposal.docx
+++ b/docs/proposal.docx
@@ -182,7 +182,7 @@
               <w:rPr>
                 <w:sz w:val="16"/>
               </w:rPr>
-              <w:t>AI-powered Quality Control and Defect Detection in Electronics Assembly: Reducing False Calls of Automated Optical Inspection</w:t>
+              <w:t>Second Check of AOI Results with Supervised Machine Learning: Quality Control and Defect Detection in Electronics Assembly</w:t>
             </w:r>
           </w:p>
         </w:tc>
@@ -308,7 +308,7 @@
               <w:rPr>
                 <w:sz w:val="16"/>
               </w:rPr>
-              <w:t>Quality inspection in electronics assembly, based on the lecture example “Siemens – Quality Control and Defect Detection” (p. 18). After automated optical inspection (AOI), flagged boards go to manual inspection. Current problem: on 21 Oct 2026 Siemens and NVIDIA announced an AI second check of AOI results in the Siemens electronics factory in Erlangen, targeting about 40 % fewer false calls.</w:t>
+              <w:t>Quality inspection in electronics assembly, based on the lecture example “Siemens – Quality Control and Defect Detection” (p. 18). After automated optical inspection (AOI), flagged boards go to manual inspection. Current problem: on 21 Oct 2026 Siemens and NVIDIA announced an “AI second check of AOI results” in the Siemens electronics factory in Erlangen, targeting about 40 % fewer false calls.</w:t>
             </w:r>
           </w:p>
         </w:tc>
@@ -345,7 +345,7 @@
               <w:rPr>
                 <w:sz w:val="16"/>
               </w:rPr>
-              <w:t>quality control, defect detection, automated optical inspection, machine learning, neural network, big data processing</w:t>
+              <w:t>quality control, defect detection, automated optical inspection, supervised machine learning, binary classification, big data processing</w:t>
             </w:r>
           </w:p>
         </w:tc>

</xml_diff>

<commit_message>
Subtitle: binary classification of AOI alarms into true defects and false calls
</commit_message>
<xml_diff>
--- a/docs/proposal.docx
+++ b/docs/proposal.docx
@@ -182,7 +182,7 @@
               <w:rPr>
                 <w:sz w:val="16"/>
               </w:rPr>
-              <w:t>Second Check of AOI Results with Supervised Machine Learning: Quality Control and Defect Detection in Electronics Assembly</w:t>
+              <w:t>Second Check of AOI Results with Supervised Machine Learning: Binary Classification of AOI Alarms into True Defects and False Calls</w:t>
             </w:r>
           </w:p>
         </w:tc>
@@ -345,7 +345,7 @@
               <w:rPr>
                 <w:sz w:val="16"/>
               </w:rPr>
-              <w:t>quality control, defect detection, automated optical inspection, supervised machine learning, binary classification, big data processing</w:t>
+              <w:t>automated optical inspection, false calls, second check, supervised machine learning, binary classification, electronics assembly</w:t>
             </w:r>
           </w:p>
         </w:tc>

</xml_diff>

<commit_message>
Precise scope and metrics: recall and specificity of the binary classification
</commit_message>
<xml_diff>
--- a/docs/proposal.docx
+++ b/docs/proposal.docx
@@ -308,7 +308,7 @@
               <w:rPr>
                 <w:sz w:val="16"/>
               </w:rPr>
-              <w:t>Quality inspection in electronics assembly, based on the lecture example “Siemens – Quality Control and Defect Detection” (p. 18). After automated optical inspection (AOI), flagged boards go to manual inspection. Current problem: on 21 Oct 2026 Siemens and NVIDIA announced an “AI second check of AOI results” in the Siemens electronics factory in Erlangen, targeting about 40 % fewer false calls.</w:t>
+              <w:t>Second check of AOI results in electronics assembly (SMT soldering): after automated optical inspection (AOI), every flagged board goes to manual inspection. Lecture example: “Siemens – Quality Control and Defect Detection” (p. 18). Current problem: on 21 Oct 2026 Siemens and NVIDIA announced an “AI second check of AOI results” in the Siemens electronics factory in Erlangen, targeting about 40 % fewer false calls.</w:t>
             </w:r>
           </w:p>
         </w:tc>
@@ -484,7 +484,7 @@
               <w:rPr>
                 <w:sz w:val="16"/>
               </w:rPr>
-              <w:t>After soldering, an AOI camera system checks every solder joint against fixed limits and sends flagged boards to manual inspection. In real Siemens production data about 98 % of the flagged boards are false calls, so operators check thousands of good boards. Input: the AOI alarm (measurements of a flagged board) → System: binary classification (supervised machine learning) trained on past manual-inspection results → Output: for each AOI alarm, true defect (manual inspection) or false call (skip manual inspection). Measurable outcomes: defective boards classified as false calls ≤ 1 %; false calls correctly identified ≥ 20 % (baseline 6.4 %); precision and recall.</w:t>
+              <w:t>After soldering, an AOI camera system checks every solder joint against fixed limits and sends flagged boards to manual inspection. In real Siemens production data about 98 % of the flagged boards are false calls, so operators check thousands of good boards. Input: the AOI alarm (one flagged board, about 70 AOI measurements per flagged solder joint) → System: binary classification (supervised machine learning) trained on past manual-inspection results → Output: for each AOI alarm, true defect (manual inspection) or false call (skip manual inspection). Measurable outcomes (positive class = true defect): recall ≥ 99 % (at most 1 % of true defects classified as false call) and specificity ≥ 20 % (false calls correctly classified; baseline 6.4 %).</w:t>
             </w:r>
           </w:p>
         </w:tc>
@@ -521,7 +521,7 @@
               <w:rPr>
                 <w:sz w:val="16"/>
               </w:rPr>
-              <w:t>Key motivations: reduce dependence on manual quality checks, keep product quality, and increase efficiency of the assembly line (lecture goal: better quality). Siemens is working on exactly this problem in its Erlangen electronics factory (Oct 2026).</w:t>
+              <w:t>Key motivation: fewer manual re-inspections of false calls (operator time, throughput), while true defects are still caught. Siemens is working on this problem in its Erlangen electronics factory (Oct 2026).</w:t>
             </w:r>
           </w:p>
         </w:tc>
@@ -558,7 +558,7 @@
               <w:rPr>
                 <w:sz w:val="16"/>
               </w:rPr>
-              <w:t>Pfab et al. (2024) published the Siemens AOI data. Albayari et al. (2025) used XGBoost, random forest and neural networks on the same data with a random split. Gap addressed: evaluation in time order, as on the real line, with a fixed limit on missed defects.</w:t>
+              <w:t>Pfab et al. (2024) published the Siemens AOI data. Albayari et al. (2025) used XGBoost, random forest and neural networks on the same data with a random split. Gap addressed: evaluation in time order, as in operation, with a fixed minimum recall for true defects.</w:t>
             </w:r>
           </w:p>
         </w:tc>
@@ -595,7 +595,7 @@
               <w:rPr>
                 <w:sz w:val="16"/>
               </w:rPr>
-              <w:t>Methodology: CRISP-DM. Data: Siemens AOI data (Mendeley, CC BY-NC 3.0), 440,274 flagged solder joints on 39,742 boards from 132 days, about 70 measurements each, labelled by manual inspection. Models (scikit-learn): logistic regression (baseline), random forest, and a neural network with one hidden layer (lecture p. 12, 17). Simulation: the line is simulated day by day; each day is decided by a model trained on earlier days only. MVP running: in time order 1.8–6.4 % of false calls are correctly identified while 99 % of defects are caught (14–18 % with a random split). Deliverables: Python software prototype, notebook, tests on GitHub, demo video, report (IEEE template).</w:t>
+              <w:t>Methodology: CRISP-DM. Data: Siemens AOI data (Mendeley, CC BY-NC 3.0), 440,274 flagged solder joints on 39,742 boards from 132 days, about 70 measurements each, labelled by manual inspection. Models (scikit-learn): logistic regression (baseline), random forest, and a neural network with one hidden layer (lecture p. 12, 17). Simulation: day-by-day simulation on the recorded production days (walk-forward evaluation); each day is classified by a model trained on earlier days only. MVP running: in time order, at 99 % recall, specificity is 1.8–6.4 % (14–18 % with a random split). Deliverables: Python software prototype, notebook, tests on GitHub, demo video, report (IEEE template).</w:t>
             </w:r>
           </w:p>
         </w:tc>
@@ -724,7 +724,7 @@
               <w:rPr>
                 <w:sz w:val="16"/>
               </w:rPr>
-              <w:t>Simulation-only environment; no physical machinery risk. Data anonymised by Siemens, no personal data; licence non-commercial (course use). Limits: one production line, 132 days, labels from operators. Main risk: the line changes over time, so the 1 % limit may not hold (fallback: report what works and why).</w:t>
+              <w:t>Simulation-only environment; no physical machinery risk. Data anonymised by Siemens, no personal data; licence non-commercial (course use). Limits: one production line, 132 days, labels from operators. Main risk: the line changes over time, so 99 % recall may not hold on later days (fallback: report what works and why).</w:t>
             </w:r>
           </w:p>
         </w:tc>

</xml_diff>

<commit_message>
Proposal: risks in two sentences, contact order
</commit_message>
<xml_diff>
--- a/docs/proposal.docx
+++ b/docs/proposal.docx
@@ -259,19 +259,7 @@
               <w:rPr>
                 <w:sz w:val="16"/>
               </w:rPr>
-              <w:t>melisa.subasi@stud.th-deg.de ·</w:t>
-            </w:r>
-            <w:r>
-              <w:rPr>
-                <w:sz w:val="16"/>
-              </w:rPr>
-              <w:t xml:space="preserve"> </w:t>
-            </w:r>
-            <w:r>
-              <w:rPr>
-                <w:sz w:val="16"/>
-              </w:rPr>
-              <w:t>han.yu@stud.th-deg.de · alejandro.rivas@stud.th-deg.de · meron.hagos@stud.th-deg.de</w:t>
+              <w:t>han.yu@stud.th-deg.de · melisa.subasi@stud.th-deg.de · meron.hagos@stud.th-deg.de · alejandro.rivas@stud.th-deg.de</w:t>
             </w:r>
           </w:p>
         </w:tc>
@@ -724,7 +712,7 @@
               <w:rPr>
                 <w:sz w:val="16"/>
               </w:rPr>
-              <w:t>Simulation-only environment; no physical machinery risk. Data anonymised by Siemens, no personal data; licence non-commercial (course use). Limits: one production line, 132 days, labels from operators. Main risk: the line changes over time, so 99 % recall may not hold on later days (fallback: report what works and why).</w:t>
+              <w:t>Simulation-only environment with anonymised Siemens data (no personal data, non-commercial licence for course use), so there is no physical machinery or privacy risk. Main risks: one production line, 132 days and operator labels only, and the line changes over time, so 99 % recall may not hold on later days (fallback: report what works and why).</w:t>
             </w:r>
           </w:p>
         </w:tc>

</xml_diff>